<commit_message>
Snapshot before research-brief bias fixes (md-docx and research-brief WIP)
Co-Authored-By: Claude Opus 5.5 (1M context) <noreply@anthropic.com>
</commit_message>
<xml_diff>
--- a/skills/md-docx/reference.docx
+++ b/skills/md-docx/reference.docx
@@ -5,6 +5,7 @@
     <w:p>
       <w:pPr>
         <w:pStyle w:val="Title"/>
+        <w:spacing w:after="240"/>
       </w:pPr>
       <w:r>
         <w:t xml:space="preserve">Title </w:t>
@@ -15,69 +16,7 @@
     </w:p>
     <w:p>
       <w:pPr>
-        <w:pStyle w:val="Author"/>
-        <w:rPr>
-          <w:lang w:val="en-NZ"/>
-        </w:rPr>
-      </w:pPr>
-      <w:r>
-        <w:rPr>
-          <w:lang w:val="en-NZ"/>
-        </w:rPr>
-        <w:t>Authors</w:t>
-      </w:r>
-    </w:p>
-    <w:p>
-      <w:pPr>
-        <w:pStyle w:val="Author"/>
-        <w:rPr>
-          <w:lang w:val="en-NZ"/>
-        </w:rPr>
-      </w:pPr>
-      <w:r>
-        <w:rPr>
-          <w:lang w:val="en-NZ"/>
-        </w:rPr>
-        <w:t>Name</w:t>
-      </w:r>
-    </w:p>
-    <w:p>
-      <w:pPr>
-        <w:pStyle w:val="Author"/>
-        <w:rPr>
-          <w:lang w:val="en-NZ"/>
-        </w:rPr>
-      </w:pPr>
-      <w:r>
-        <w:rPr>
-          <w:rFonts w:cs="Times New Roman"/>
-        </w:rPr>
-        <w:t>University</w:t>
-      </w:r>
-      <w:r>
-        <w:rPr>
-          <w:lang w:val="en-NZ"/>
-        </w:rPr>
-        <w:t xml:space="preserve"> [ORCID]</w:t>
-      </w:r>
-    </w:p>
-    <w:p>
-      <w:pPr>
-        <w:pStyle w:val="Author"/>
-        <w:rPr>
-          <w:lang w:val="en-NZ"/>
-        </w:rPr>
-      </w:pPr>
-      <w:r>
-        <w:rPr>
-          <w:lang w:val="en-NZ"/>
-        </w:rPr>
-        <w:t>Name</w:t>
-      </w:r>
-    </w:p>
-    <w:p>
-      <w:pPr>
-        <w:pStyle w:val="Subtitle"/>
+        <w:pStyle w:val="AbstractTitle"/>
       </w:pPr>
       <w:r>
         <w:t>Abstract</w:t>
@@ -88,10 +27,7 @@
         <w:pStyle w:val="Abstract"/>
       </w:pPr>
       <w:r>
-        <w:t xml:space="preserve">Abstract body </w:t>
-      </w:r>
-      <w:r>
-        <w:br w:type="page"/>
+        <w:t>The love of men is a frigid thing, a mountain stream only three steps from the ice. We are his. Oh Stormfather . . . we are his. It is but a thousand days, and the Everstorm comes.</w:t>
       </w:r>
     </w:p>
     <w:sdt>
@@ -132,7 +68,7 @@
             <w:pStyle w:val="TOC1"/>
             <w:tabs>
               <w:tab w:val="left" w:pos="480"/>
-              <w:tab w:val="right" w:leader="dot" w:pos="9350"/>
+              <w:tab w:val="right" w:leader="dot" w:pos="9962"/>
             </w:tabs>
             <w:rPr>
               <w:rFonts w:asciiTheme="minorHAnsi" w:eastAsiaTheme="minorEastAsia" w:hAnsiTheme="minorHAnsi"/>
@@ -151,7 +87,7 @@
           <w:r>
             <w:fldChar w:fldCharType="separate"/>
           </w:r>
-          <w:hyperlink w:anchor="_Toc231989208" w:history="1">
+          <w:hyperlink w:anchor="_Toc240896004" w:history="1">
             <w:r>
               <w:rPr>
                 <w:rStyle w:val="Hyperlink"/>
@@ -174,7 +110,7 @@
                 <w:rStyle w:val="Hyperlink"/>
                 <w:noProof/>
               </w:rPr>
-              <w:t>Introduction</w:t>
+              <w:t>Heading 1</w:t>
             </w:r>
             <w:r>
               <w:rPr>
@@ -195,7 +131,7 @@
                 <w:noProof/>
                 <w:webHidden/>
               </w:rPr>
-              <w:instrText xml:space="preserve"> PAGEREF _Toc231989208 \h </w:instrText>
+              <w:instrText xml:space="preserve"> PAGEREF _Toc240896004 \h </w:instrText>
             </w:r>
             <w:r>
               <w:rPr>
@@ -215,7 +151,7 @@
                 <w:noProof/>
                 <w:webHidden/>
               </w:rPr>
-              <w:t>i</w:t>
+              <w:t>1</w:t>
             </w:r>
             <w:r>
               <w:rPr>
@@ -228,10 +164,10 @@
         </w:p>
         <w:p>
           <w:pPr>
-            <w:pStyle w:val="TOC1"/>
+            <w:pStyle w:val="TOC2"/>
             <w:tabs>
-              <w:tab w:val="left" w:pos="480"/>
-              <w:tab w:val="right" w:leader="dot" w:pos="9350"/>
+              <w:tab w:val="left" w:pos="960"/>
+              <w:tab w:val="right" w:leader="dot" w:pos="9962"/>
             </w:tabs>
             <w:rPr>
               <w:rFonts w:asciiTheme="minorHAnsi" w:eastAsiaTheme="minorEastAsia" w:hAnsiTheme="minorHAnsi"/>
@@ -241,13 +177,13 @@
               <w14:ligatures w14:val="standardContextual"/>
             </w:rPr>
           </w:pPr>
-          <w:hyperlink w:anchor="_Toc231989209" w:history="1">
+          <w:hyperlink w:anchor="_Toc240896005" w:history="1">
             <w:r>
               <w:rPr>
                 <w:rStyle w:val="Hyperlink"/>
                 <w:noProof/>
               </w:rPr>
-              <w:t>2</w:t>
+              <w:t>1.1</w:t>
             </w:r>
             <w:r>
               <w:rPr>
@@ -264,7 +200,7 @@
                 <w:rStyle w:val="Hyperlink"/>
                 <w:noProof/>
               </w:rPr>
-              <w:t>Methods</w:t>
+              <w:t>Heading 2</w:t>
             </w:r>
             <w:r>
               <w:rPr>
@@ -285,7 +221,7 @@
                 <w:noProof/>
                 <w:webHidden/>
               </w:rPr>
-              <w:instrText xml:space="preserve"> PAGEREF _Toc231989209 \h </w:instrText>
+              <w:instrText xml:space="preserve"> PAGEREF _Toc240896005 \h </w:instrText>
             </w:r>
             <w:r>
               <w:rPr>
@@ -305,7 +241,7 @@
                 <w:noProof/>
                 <w:webHidden/>
               </w:rPr>
-              <w:t>i</w:t>
+              <w:t>1</w:t>
             </w:r>
             <w:r>
               <w:rPr>
@@ -318,10 +254,10 @@
         </w:p>
         <w:p>
           <w:pPr>
-            <w:pStyle w:val="TOC2"/>
+            <w:pStyle w:val="TOC3"/>
             <w:tabs>
-              <w:tab w:val="left" w:pos="960"/>
-              <w:tab w:val="right" w:leader="dot" w:pos="9350"/>
+              <w:tab w:val="left" w:pos="1440"/>
+              <w:tab w:val="right" w:leader="dot" w:pos="9962"/>
             </w:tabs>
             <w:rPr>
               <w:rFonts w:asciiTheme="minorHAnsi" w:eastAsiaTheme="minorEastAsia" w:hAnsiTheme="minorHAnsi"/>
@@ -331,13 +267,13 @@
               <w14:ligatures w14:val="standardContextual"/>
             </w:rPr>
           </w:pPr>
-          <w:hyperlink w:anchor="_Toc231989210" w:history="1">
+          <w:hyperlink w:anchor="_Toc240896006" w:history="1">
             <w:r>
               <w:rPr>
                 <w:rStyle w:val="Hyperlink"/>
                 <w:noProof/>
               </w:rPr>
-              <w:t>2.1</w:t>
+              <w:t>1.1.1</w:t>
             </w:r>
             <w:r>
               <w:rPr>
@@ -354,7 +290,7 @@
                 <w:rStyle w:val="Hyperlink"/>
                 <w:noProof/>
               </w:rPr>
-              <w:t>Reference Database Retrieval</w:t>
+              <w:t>Seed Heading 3</w:t>
             </w:r>
             <w:r>
               <w:rPr>
@@ -375,7 +311,7 @@
                 <w:noProof/>
                 <w:webHidden/>
               </w:rPr>
-              <w:instrText xml:space="preserve"> PAGEREF _Toc231989210 \h </w:instrText>
+              <w:instrText xml:space="preserve"> PAGEREF _Toc240896006 \h </w:instrText>
             </w:r>
             <w:r>
               <w:rPr>
@@ -395,367 +331,7 @@
                 <w:noProof/>
                 <w:webHidden/>
               </w:rPr>
-              <w:t>i</w:t>
-            </w:r>
-            <w:r>
-              <w:rPr>
-                <w:noProof/>
-                <w:webHidden/>
-              </w:rPr>
-              <w:fldChar w:fldCharType="end"/>
-            </w:r>
-          </w:hyperlink>
-        </w:p>
-        <w:p>
-          <w:pPr>
-            <w:pStyle w:val="TOC3"/>
-            <w:tabs>
-              <w:tab w:val="left" w:pos="1440"/>
-              <w:tab w:val="right" w:leader="dot" w:pos="9350"/>
-            </w:tabs>
-            <w:rPr>
-              <w:rFonts w:asciiTheme="minorHAnsi" w:eastAsiaTheme="minorEastAsia" w:hAnsiTheme="minorHAnsi"/>
-              <w:noProof/>
-              <w:kern w:val="2"/>
-              <w:lang w:eastAsia="en-NZ"/>
-              <w14:ligatures w14:val="standardContextual"/>
-            </w:rPr>
-          </w:pPr>
-          <w:hyperlink w:anchor="_Toc231989211" w:history="1">
-            <w:r>
-              <w:rPr>
-                <w:rStyle w:val="Hyperlink"/>
-                <w:noProof/>
-              </w:rPr>
-              <w:t>2.1.1</w:t>
-            </w:r>
-            <w:r>
-              <w:rPr>
-                <w:rFonts w:asciiTheme="minorHAnsi" w:eastAsiaTheme="minorEastAsia" w:hAnsiTheme="minorHAnsi"/>
-                <w:noProof/>
-                <w:kern w:val="2"/>
-                <w:lang w:eastAsia="en-NZ"/>
-                <w14:ligatures w14:val="standardContextual"/>
-              </w:rPr>
-              <w:tab/>
-            </w:r>
-            <w:r>
-              <w:rPr>
-                <w:rStyle w:val="Hyperlink"/>
-                <w:noProof/>
-              </w:rPr>
-              <w:t>Seed corpus and manual expansion</w:t>
-            </w:r>
-            <w:r>
-              <w:rPr>
-                <w:noProof/>
-                <w:webHidden/>
-              </w:rPr>
-              <w:tab/>
-            </w:r>
-            <w:r>
-              <w:rPr>
-                <w:noProof/>
-                <w:webHidden/>
-              </w:rPr>
-              <w:fldChar w:fldCharType="begin"/>
-            </w:r>
-            <w:r>
-              <w:rPr>
-                <w:noProof/>
-                <w:webHidden/>
-              </w:rPr>
-              <w:instrText xml:space="preserve"> PAGEREF _Toc231989211 \h </w:instrText>
-            </w:r>
-            <w:r>
-              <w:rPr>
-                <w:noProof/>
-                <w:webHidden/>
-              </w:rPr>
-            </w:r>
-            <w:r>
-              <w:rPr>
-                <w:noProof/>
-                <w:webHidden/>
-              </w:rPr>
-              <w:fldChar w:fldCharType="separate"/>
-            </w:r>
-            <w:r>
-              <w:rPr>
-                <w:noProof/>
-                <w:webHidden/>
-              </w:rPr>
-              <w:t>i</w:t>
-            </w:r>
-            <w:r>
-              <w:rPr>
-                <w:noProof/>
-                <w:webHidden/>
-              </w:rPr>
-              <w:fldChar w:fldCharType="end"/>
-            </w:r>
-          </w:hyperlink>
-        </w:p>
-        <w:p>
-          <w:pPr>
-            <w:pStyle w:val="TOC3"/>
-            <w:tabs>
-              <w:tab w:val="left" w:pos="1440"/>
-              <w:tab w:val="right" w:leader="dot" w:pos="9350"/>
-            </w:tabs>
-            <w:rPr>
-              <w:rFonts w:asciiTheme="minorHAnsi" w:eastAsiaTheme="minorEastAsia" w:hAnsiTheme="minorHAnsi"/>
-              <w:noProof/>
-              <w:kern w:val="2"/>
-              <w:lang w:eastAsia="en-NZ"/>
-              <w14:ligatures w14:val="standardContextual"/>
-            </w:rPr>
-          </w:pPr>
-          <w:hyperlink w:anchor="_Toc231989212" w:history="1">
-            <w:r>
-              <w:rPr>
-                <w:rStyle w:val="Hyperlink"/>
-                <w:noProof/>
-              </w:rPr>
-              <w:t>2.1.2</w:t>
-            </w:r>
-            <w:r>
-              <w:rPr>
-                <w:rFonts w:asciiTheme="minorHAnsi" w:eastAsiaTheme="minorEastAsia" w:hAnsiTheme="minorHAnsi"/>
-                <w:noProof/>
-                <w:kern w:val="2"/>
-                <w:lang w:eastAsia="en-NZ"/>
-                <w14:ligatures w14:val="standardContextual"/>
-              </w:rPr>
-              <w:tab/>
-            </w:r>
-            <w:r>
-              <w:rPr>
-                <w:rStyle w:val="Hyperlink"/>
-                <w:noProof/>
-              </w:rPr>
-              <w:t>Hybrid Graph Construction</w:t>
-            </w:r>
-            <w:r>
-              <w:rPr>
-                <w:noProof/>
-                <w:webHidden/>
-              </w:rPr>
-              <w:tab/>
-            </w:r>
-            <w:r>
-              <w:rPr>
-                <w:noProof/>
-                <w:webHidden/>
-              </w:rPr>
-              <w:fldChar w:fldCharType="begin"/>
-            </w:r>
-            <w:r>
-              <w:rPr>
-                <w:noProof/>
-                <w:webHidden/>
-              </w:rPr>
-              <w:instrText xml:space="preserve"> PAGEREF _Toc231989212 \h </w:instrText>
-            </w:r>
-            <w:r>
-              <w:rPr>
-                <w:noProof/>
-                <w:webHidden/>
-              </w:rPr>
-            </w:r>
-            <w:r>
-              <w:rPr>
-                <w:noProof/>
-                <w:webHidden/>
-              </w:rPr>
-              <w:fldChar w:fldCharType="separate"/>
-            </w:r>
-            <w:r>
-              <w:rPr>
-                <w:noProof/>
-                <w:webHidden/>
-              </w:rPr>
-              <w:t>ii</w:t>
-            </w:r>
-            <w:r>
-              <w:rPr>
-                <w:noProof/>
-                <w:webHidden/>
-              </w:rPr>
-              <w:fldChar w:fldCharType="end"/>
-            </w:r>
-          </w:hyperlink>
-        </w:p>
-        <w:p>
-          <w:pPr>
-            <w:pStyle w:val="TOC2"/>
-            <w:tabs>
-              <w:tab w:val="left" w:pos="960"/>
-              <w:tab w:val="right" w:leader="dot" w:pos="9350"/>
-            </w:tabs>
-            <w:rPr>
-              <w:rFonts w:asciiTheme="minorHAnsi" w:eastAsiaTheme="minorEastAsia" w:hAnsiTheme="minorHAnsi"/>
-              <w:noProof/>
-              <w:kern w:val="2"/>
-              <w:lang w:eastAsia="en-NZ"/>
-              <w14:ligatures w14:val="standardContextual"/>
-            </w:rPr>
-          </w:pPr>
-          <w:hyperlink w:anchor="_Toc231989213" w:history="1">
-            <w:r>
-              <w:rPr>
-                <w:rStyle w:val="Hyperlink"/>
-                <w:noProof/>
-              </w:rPr>
-              <w:t>2.2</w:t>
-            </w:r>
-            <w:r>
-              <w:rPr>
-                <w:rFonts w:asciiTheme="minorHAnsi" w:eastAsiaTheme="minorEastAsia" w:hAnsiTheme="minorHAnsi"/>
-                <w:noProof/>
-                <w:kern w:val="2"/>
-                <w:lang w:eastAsia="en-NZ"/>
-                <w14:ligatures w14:val="standardContextual"/>
-              </w:rPr>
-              <w:tab/>
-            </w:r>
-            <w:r>
-              <w:rPr>
-                <w:rStyle w:val="Hyperlink"/>
-                <w:noProof/>
-              </w:rPr>
-              <w:t>Thematic landscape</w:t>
-            </w:r>
-            <w:r>
-              <w:rPr>
-                <w:noProof/>
-                <w:webHidden/>
-              </w:rPr>
-              <w:tab/>
-            </w:r>
-            <w:r>
-              <w:rPr>
-                <w:noProof/>
-                <w:webHidden/>
-              </w:rPr>
-              <w:fldChar w:fldCharType="begin"/>
-            </w:r>
-            <w:r>
-              <w:rPr>
-                <w:noProof/>
-                <w:webHidden/>
-              </w:rPr>
-              <w:instrText xml:space="preserve"> PAGEREF _Toc231989213 \h </w:instrText>
-            </w:r>
-            <w:r>
-              <w:rPr>
-                <w:noProof/>
-                <w:webHidden/>
-              </w:rPr>
-            </w:r>
-            <w:r>
-              <w:rPr>
-                <w:noProof/>
-                <w:webHidden/>
-              </w:rPr>
-              <w:fldChar w:fldCharType="separate"/>
-            </w:r>
-            <w:r>
-              <w:rPr>
-                <w:noProof/>
-                <w:webHidden/>
-              </w:rPr>
-              <w:t>ii</w:t>
-            </w:r>
-            <w:r>
-              <w:rPr>
-                <w:noProof/>
-                <w:webHidden/>
-              </w:rPr>
-              <w:fldChar w:fldCharType="end"/>
-            </w:r>
-          </w:hyperlink>
-        </w:p>
-        <w:p>
-          <w:pPr>
-            <w:pStyle w:val="TOC1"/>
-            <w:tabs>
-              <w:tab w:val="left" w:pos="480"/>
-              <w:tab w:val="right" w:leader="dot" w:pos="9350"/>
-            </w:tabs>
-            <w:rPr>
-              <w:rFonts w:asciiTheme="minorHAnsi" w:eastAsiaTheme="minorEastAsia" w:hAnsiTheme="minorHAnsi"/>
-              <w:noProof/>
-              <w:kern w:val="2"/>
-              <w:lang w:eastAsia="en-NZ"/>
-              <w14:ligatures w14:val="standardContextual"/>
-            </w:rPr>
-          </w:pPr>
-          <w:hyperlink w:anchor="_Toc231989214" w:history="1">
-            <w:r>
-              <w:rPr>
-                <w:rStyle w:val="Hyperlink"/>
-                <w:noProof/>
-              </w:rPr>
-              <w:t>3</w:t>
-            </w:r>
-            <w:r>
-              <w:rPr>
-                <w:rFonts w:asciiTheme="minorHAnsi" w:eastAsiaTheme="minorEastAsia" w:hAnsiTheme="minorHAnsi"/>
-                <w:noProof/>
-                <w:kern w:val="2"/>
-                <w:lang w:eastAsia="en-NZ"/>
-                <w14:ligatures w14:val="standardContextual"/>
-              </w:rPr>
-              <w:tab/>
-            </w:r>
-            <w:r>
-              <w:rPr>
-                <w:rStyle w:val="Hyperlink"/>
-                <w:noProof/>
-              </w:rPr>
-              <w:t>References</w:t>
-            </w:r>
-            <w:r>
-              <w:rPr>
-                <w:noProof/>
-                <w:webHidden/>
-              </w:rPr>
-              <w:tab/>
-            </w:r>
-            <w:r>
-              <w:rPr>
-                <w:noProof/>
-                <w:webHidden/>
-              </w:rPr>
-              <w:fldChar w:fldCharType="begin"/>
-            </w:r>
-            <w:r>
-              <w:rPr>
-                <w:noProof/>
-                <w:webHidden/>
-              </w:rPr>
-              <w:instrText xml:space="preserve"> PAGEREF _Toc231989214 \h </w:instrText>
-            </w:r>
-            <w:r>
-              <w:rPr>
-                <w:noProof/>
-                <w:webHidden/>
-              </w:rPr>
-            </w:r>
-            <w:r>
-              <w:rPr>
-                <w:noProof/>
-                <w:webHidden/>
-              </w:rPr>
-              <w:fldChar w:fldCharType="separate"/>
-            </w:r>
-            <w:r>
-              <w:rPr>
-                <w:noProof/>
-                <w:webHidden/>
-              </w:rPr>
-              <w:t>vi</w:t>
+              <w:t>1</w:t>
             </w:r>
             <w:r>
               <w:rPr>
@@ -787,37 +363,14 @@
     </w:sdt>
     <w:p>
       <w:pPr>
-        <w:pStyle w:val="Subtitle"/>
-        <w:rPr>
-          <w:szCs w:val="24"/>
-        </w:rPr>
-      </w:pPr>
-      <w:r>
-        <w:br w:type="page"/>
-      </w:r>
-    </w:p>
-    <w:p>
-      <w:pPr>
-        <w:pStyle w:val="BodyText"/>
-        <w:sectPr>
-          <w:headerReference w:type="default" r:id="rId8"/>
-          <w:footerReference w:type="default" r:id="rId9"/>
-          <w:pgSz w:w="12240" w:h="15840"/>
-          <w:pgMar w:top="1440" w:right="1440" w:bottom="1440" w:left="1440" w:header="567" w:footer="567" w:gutter="0"/>
-          <w:pgNumType w:fmt="lowerRoman"/>
-          <w:cols w:space="720"/>
-          <w:docGrid w:linePitch="326"/>
-        </w:sectPr>
-      </w:pPr>
-    </w:p>
-    <w:p>
-      <w:pPr>
         <w:pStyle w:val="Heading1"/>
       </w:pPr>
-      <w:bookmarkStart w:id="0" w:name="_Toc231989208"/>
+      <w:bookmarkStart w:id="0" w:name="_Toc240896004"/>
       <w:r>
-        <w:lastRenderedPageBreak/>
-        <w:t>Introduction</w:t>
+        <w:t>Heading</w:t>
+      </w:r>
+      <w:r>
+        <w:t xml:space="preserve"> 1</w:t>
       </w:r>
       <w:bookmarkEnd w:id="0"/>
     </w:p>
@@ -825,32 +378,24 @@
       <w:pPr>
         <w:pStyle w:val="BodyText"/>
       </w:pPr>
+      <w:bookmarkStart w:id="1" w:name="_Ref_s2_1"/>
+      <w:bookmarkStart w:id="2" w:name="_Toc240896005"/>
       <w:r>
-        <w:t>body text.</w:t>
+        <w:t xml:space="preserve">Szeth-son-son-Vallano, </w:t>
       </w:r>
-    </w:p>
-    <w:p>
-      <w:pPr>
-        <w:pStyle w:val="Heading1"/>
-      </w:pPr>
-      <w:bookmarkStart w:id="1" w:name="_Ref227531540"/>
-      <w:bookmarkStart w:id="2" w:name="_Ref227531573"/>
-      <w:bookmarkStart w:id="3" w:name="_Toc231989209"/>
       <w:r>
-        <w:t>Methods</w:t>
+        <w:t>Truthless</w:t>
       </w:r>
-      <w:bookmarkEnd w:id="1"/>
-      <w:bookmarkEnd w:id="2"/>
-      <w:bookmarkEnd w:id="3"/>
+      <w:r>
+        <w:t xml:space="preserve"> of Shinovar, wore white on the day he was to kill a king. The white clothing was a Parshendi tradition, foreign to him. But he did as his masters required and did not ask for an explanation.</w:t>
+      </w:r>
     </w:p>
     <w:p>
       <w:pPr>
         <w:pStyle w:val="BodyText"/>
       </w:pPr>
-      <w:bookmarkStart w:id="4" w:name="_Toc231989210"/>
-      <w:bookmarkStart w:id="5" w:name="_Ref_s2_1"/>
       <w:r>
-        <w:t>body text.</w:t>
+        <w:t>He sat in a large stone room, baked by enormous firepits that cast a garish light upon the revelers, causing beads of sweat to form on their skin as they danced, and drank, and yelled, and sang, and clapped. Some fell to the ground red-faced, the revelry too much for them, their stomachs proving to be inferior wineskins. They looked as if they were dead, at least until their friends carried them out of the feast hall to waiting beds.</w:t>
       </w:r>
     </w:p>
     <w:p>
@@ -858,38 +403,71 @@
         <w:pStyle w:val="Heading2"/>
       </w:pPr>
       <w:r>
-        <w:t>Reference Database Retrieval</w:t>
+        <w:t>Heading</w:t>
       </w:r>
-      <w:bookmarkEnd w:id="4"/>
+      <w:r>
+        <w:t xml:space="preserve"> 2</w:t>
+      </w:r>
+      <w:bookmarkEnd w:id="2"/>
     </w:p>
     <w:p>
       <w:pPr>
         <w:pStyle w:val="BodyText"/>
       </w:pPr>
-      <w:bookmarkStart w:id="6" w:name="_Toc231989211"/>
-      <w:bookmarkStart w:id="7" w:name="_Ref_s2_1_1"/>
-      <w:bookmarkEnd w:id="5"/>
+      <w:bookmarkStart w:id="3" w:name="_Ref_s2_1_1"/>
+      <w:bookmarkEnd w:id="1"/>
       <w:r>
-        <w:t>body text.</w:t>
+        <w:t>Szeth did not sway to the drums, drink the sapphire wine, or stand to dance. He sat on a bench at the back, a still servant in white robes. Few at the treaty-signing celebration noticed him. He was just a servant, and Shin were easy to ignore. Most out here in the East thought Szeth’s kind were docile and harmless. They were generally right.</w:t>
+      </w:r>
+    </w:p>
+    <w:p>
+      <w:pPr>
+        <w:pStyle w:val="BodyText"/>
+      </w:pPr>
+      <w:r>
+        <w:t xml:space="preserve">The drummers began a new rhythm. The beats shook Szeth like a quartet of thumping hearts, pumping waves of invisible blood through the room. Szeth’s masters—who were dismissed as savages by those in more civilized kingdoms—sat at their own tables. They were men with skin of black marbled with red. Parshendi, they were </w:t>
+      </w:r>
+      <w:proofErr w:type="gramStart"/>
+      <w:r>
+        <w:t>named—cousins</w:t>
+      </w:r>
+      <w:proofErr w:type="gramEnd"/>
+      <w:r>
+        <w:t xml:space="preserve"> to the more docile servant peoples known as parshmen </w:t>
+      </w:r>
+      <w:r>
+        <w:lastRenderedPageBreak/>
+        <w:t>in most of the world. An oddity. They did not call themselves Parshendi; this was the Alethi name for them. It meant, roughly, “parshmen who can think.” Neither side seemed to see that as an insult.</w:t>
       </w:r>
     </w:p>
     <w:p>
       <w:pPr>
         <w:pStyle w:val="Heading3"/>
       </w:pPr>
+      <w:bookmarkStart w:id="4" w:name="_Toc240896006"/>
       <w:r>
-        <w:t>Seed corpus and manual expansion</w:t>
+        <w:t>Heading</w:t>
       </w:r>
-      <w:bookmarkEnd w:id="6"/>
+      <w:r>
+        <w:t xml:space="preserve"> 3</w:t>
+      </w:r>
+      <w:bookmarkEnd w:id="4"/>
+    </w:p>
+    <w:bookmarkEnd w:id="3"/>
+    <w:p>
+      <w:pPr>
+        <w:pStyle w:val="BodyText"/>
+      </w:pPr>
+      <w:r>
+        <w:t>The Parshendi had brought the musicians. At first, the Alethi lighteyes had been hesitant. To them, drums were base instruments of the common, darkeyed people. But wine was the great assassin of both tradition and propriety, and now the Alethi elite danced with abandon.</w:t>
+      </w:r>
     </w:p>
     <w:p>
       <w:pPr>
         <w:pStyle w:val="BodyText"/>
       </w:pPr>
-      <w:bookmarkStart w:id="8" w:name="_Toc231989212"/>
-      <w:bookmarkEnd w:id="7"/>
       <w:r>
-        <w:t>body text.</w:t>
+        <w:t>Szeth stood and began to pick his way through the room. The revelry had lasted long; even the king had retired hours ago. But many still celebrated. As he walked, Szeth was forced to step around Dalinar Kholin—the king’s own brother—who slumped drunken at a small table. The aging but powerfully built man kept waving away those who tried to encourage him to bed. Where was Jasnah, the king’s daughter? Elhokar, the king’s son and heir, sat at the high table, ruling the feast in his father’s absence. He was in conversation with two men, a dark-skinned Azish man who had an odd patch of pale skin on his cheek and a thinner, Alethi-looking man who kept glancing over his shoulder.</w:t>
       </w:r>
     </w:p>
     <w:p>
@@ -897,10 +475,36 @@
         <w:pStyle w:val="Heading4"/>
       </w:pPr>
       <w:r>
-        <w:t>Heading 3</w:t>
+        <w:t xml:space="preserve">Heading </w:t>
+      </w:r>
+      <w:r>
+        <w:t>4</w:t>
       </w:r>
     </w:p>
-    <w:bookmarkEnd w:id="8"/>
+    <w:p>
+      <w:pPr>
+        <w:pStyle w:val="BodyText"/>
+      </w:pPr>
+      <w:r>
+        <w:t xml:space="preserve">The heir’s feasting companions were unimportant. Szeth stayed far from the heir, skirting the sides of the room, passing the drummers. Musicspren zipped through the air around them, the tiny spirits taking the form of spinning translucent ribbons. As Szeth passed the drummers, they noted him. They would withdraw soon, along with </w:t>
+      </w:r>
+      <w:proofErr w:type="gramStart"/>
+      <w:r>
+        <w:t>all of</w:t>
+      </w:r>
+      <w:proofErr w:type="gramEnd"/>
+      <w:r>
+        <w:t xml:space="preserve"> the other Parshendi.</w:t>
+      </w:r>
+    </w:p>
+    <w:p>
+      <w:pPr>
+        <w:pStyle w:val="BodyText"/>
+      </w:pPr>
+      <w:r>
+        <w:t>They did not seem offended. They did not seem angry. And yet they were going to break their treaty of only a few hours. It made no sense. But Szeth did not ask questions</w:t>
+      </w:r>
+    </w:p>
     <w:p>
       <w:pPr>
         <w:pStyle w:val="BodyText"/>
@@ -912,7 +516,6 @@
               <m:ctrlPr>
                 <w:rPr>
                   <w:rFonts w:ascii="Cambria Math" w:hAnsi="Cambria Math"/>
-                  <w:i/>
                 </w:rPr>
               </m:ctrlPr>
             </m:sSubPr>
@@ -934,19 +537,13 @@
             </m:sub>
           </m:sSub>
           <m:r>
-            <w:rPr>
-              <w:rFonts w:ascii="Cambria Math" w:hAnsi="Cambria Math"/>
-            </w:rPr>
-            <m:t>=</m:t>
-          </m:r>
-          <m:r>
             <m:rPr>
               <m:sty m:val="p"/>
             </m:rPr>
             <w:rPr>
               <w:rFonts w:ascii="Cambria Math" w:hAnsi="Cambria Math"/>
             </w:rPr>
-            <m:t>α⋅</m:t>
+            <m:t>=α⋅</m:t>
           </m:r>
           <m:func>
             <m:funcPr>
@@ -966,12 +563,6 @@
                 </w:rPr>
                 <m:t>cos</m:t>
               </m:r>
-              <m:ctrlPr>
-                <w:rPr>
-                  <w:rFonts w:ascii="Cambria Math" w:hAnsi="Cambria Math"/>
-                  <w:i/>
-                </w:rPr>
-              </m:ctrlPr>
             </m:fName>
             <m:e>
               <m:d>
@@ -979,7 +570,6 @@
                   <m:ctrlPr>
                     <w:rPr>
                       <w:rFonts w:ascii="Cambria Math" w:hAnsi="Cambria Math"/>
-                      <w:i/>
                     </w:rPr>
                   </m:ctrlPr>
                 </m:dPr>
@@ -989,7 +579,6 @@
                       <m:ctrlPr>
                         <w:rPr>
                           <w:rFonts w:ascii="Cambria Math" w:hAnsi="Cambria Math"/>
-                          <w:i/>
                         </w:rPr>
                       </m:ctrlPr>
                     </m:sSubPr>
@@ -1011,6 +600,9 @@
                     </m:sub>
                   </m:sSub>
                   <m:r>
+                    <m:rPr>
+                      <m:sty m:val="p"/>
+                    </m:rPr>
                     <w:rPr>
                       <w:rFonts w:ascii="Cambria Math" w:hAnsi="Cambria Math"/>
                     </w:rPr>
@@ -1021,7 +613,6 @@
                       <m:ctrlPr>
                         <w:rPr>
                           <w:rFonts w:ascii="Cambria Math" w:hAnsi="Cambria Math"/>
-                          <w:i/>
                         </w:rPr>
                       </m:ctrlPr>
                     </m:sSubPr>
@@ -1047,6 +638,9 @@
             </m:e>
           </m:func>
           <m:r>
+            <m:rPr>
+              <m:sty m:val="p"/>
+            </m:rPr>
             <w:rPr>
               <w:rFonts w:ascii="Cambria Math" w:hAnsi="Cambria Math"/>
             </w:rPr>
@@ -1057,17 +651,10 @@
               <m:ctrlPr>
                 <w:rPr>
                   <w:rFonts w:ascii="Cambria Math" w:hAnsi="Cambria Math"/>
-                  <w:i/>
                 </w:rPr>
               </m:ctrlPr>
             </m:dPr>
             <m:e>
-              <m:r>
-                <w:rPr>
-                  <w:rFonts w:ascii="Cambria Math" w:hAnsi="Cambria Math"/>
-                </w:rPr>
-                <m:t>1-</m:t>
-              </m:r>
               <m:r>
                 <m:rPr>
                   <m:sty m:val="p"/>
@@ -1075,7 +662,7 @@
                 <w:rPr>
                   <w:rFonts w:ascii="Cambria Math" w:hAnsi="Cambria Math"/>
                 </w:rPr>
-                <m:t>α</m:t>
+                <m:t>1-α</m:t>
               </m:r>
             </m:e>
           </m:d>
@@ -1086,13 +673,7 @@
             <w:rPr>
               <w:rFonts w:ascii="Cambria Math" w:hAnsi="Cambria Math"/>
             </w:rPr>
-            <m:t>⋅</m:t>
-          </m:r>
-          <m:r>
-            <w:rPr>
-              <w:rFonts w:ascii="Cambria Math" w:hAnsi="Cambria Math"/>
-            </w:rPr>
-            <m:t>0.3</m:t>
+            <m:t>⋅0.3</m:t>
           </m:r>
         </m:oMath>
       </m:oMathPara>
@@ -1101,9 +682,10 @@
       <w:pPr>
         <w:pStyle w:val="Caption"/>
         <w:keepNext/>
+        <w:spacing w:after="0"/>
       </w:pPr>
-      <w:bookmarkStart w:id="9" w:name="_Ref227344452"/>
-      <w:bookmarkStart w:id="10" w:name="_Toc227940023"/>
+      <w:bookmarkStart w:id="5" w:name="_Ref227344452"/>
+      <w:bookmarkStart w:id="6" w:name="_Toc227940023"/>
       <w:r>
         <w:t xml:space="preserve">Table </w:t>
       </w:r>
@@ -1125,12 +707,12 @@
       <w:r>
         <w:fldChar w:fldCharType="end"/>
       </w:r>
-      <w:bookmarkEnd w:id="9"/>
+      <w:bookmarkEnd w:id="5"/>
       <w:r>
         <w:br/>
         <w:t>Far-field control domain clusters</w:t>
       </w:r>
-      <w:bookmarkEnd w:id="10"/>
+      <w:bookmarkEnd w:id="6"/>
     </w:p>
     <w:tbl>
       <w:tblPr>
@@ -1514,7 +1096,7 @@
                     <pic:cNvPicPr/>
                   </pic:nvPicPr>
                   <pic:blipFill>
-                    <a:blip r:embed="rId10" cstate="print">
+                    <a:blip r:embed="rId8" cstate="print">
                       <a:extLst>
                         <a:ext uri="{28A0092B-C50C-407E-A947-70E740481C1C}">
                           <a14:useLocalDpi xmlns:a14="http://schemas.microsoft.com/office/drawing/2010/main" val="0"/>
@@ -1546,8 +1128,8 @@
         <w:pStyle w:val="Caption"/>
         <w:jc w:val="both"/>
       </w:pPr>
-      <w:bookmarkStart w:id="11" w:name="_Ref227339848"/>
-      <w:bookmarkStart w:id="12" w:name="_Toc227940018"/>
+      <w:bookmarkStart w:id="7" w:name="_Ref227339848"/>
+      <w:bookmarkStart w:id="8" w:name="_Toc227940018"/>
       <w:r>
         <w:t xml:space="preserve">Figure </w:t>
       </w:r>
@@ -1569,253 +1151,24 @@
       <w:r>
         <w:fldChar w:fldCharType="end"/>
       </w:r>
-      <w:bookmarkEnd w:id="11"/>
+      <w:bookmarkEnd w:id="7"/>
       <w:r>
         <w:t xml:space="preserve"> Semantic landscape of the soil microbiome literature: 45 major themes</w:t>
       </w:r>
-      <w:bookmarkEnd w:id="12"/>
+      <w:bookmarkEnd w:id="8"/>
     </w:p>
     <w:p>
       <w:pPr>
         <w:pStyle w:val="ImageCaption"/>
       </w:pPr>
       <w:r>
-        <w:t xml:space="preserve">Two-dimensional UMAP projection of 810,517 papers coloured by scoring tier: core (red, 12 clusters by pipeline scoring, 323,551 papers, &gt;50% score 4–5), adjacent (orange, 11 clusters, 229,953 papers, &gt;50% score 3), low relevance (blue, 10 clusters, 70,487 papers, &gt;50% score 2), far-field (grey, 8 clusters, 101,813 papers, &gt;50% score 1), and mixed (green, 4 clusters, 67,879 papers). A further 16,834 orphan papers (2.1%) are shown in light grey. Cluster display names positioned at centroids. Spatial proximity reflects semantic similarity in 768-dimensional SPECTER2 embedding space. Display names assigned by presenting </w:t>
-      </w:r>
-      <w:proofErr w:type="gramStart"/>
-      <w:r>
-        <w:t>top-8</w:t>
-      </w:r>
-      <w:proofErr w:type="gramEnd"/>
-      <w:r>
-        <w:t xml:space="preserve"> TF-IDF contrastive labels to Claude Opus 4 (Anthropic, 2026) and reviewed by the author. One cluster (L1=15, COVID-19 &amp; Respiratory Virology) exceeded the core scoring threshold on shared sequencing vocabulary rather than topical relevance and was reclassified as adjacent for thematic purposes </w:t>
-      </w:r>
-      <w:r>
-        <w:t xml:space="preserve">(see </w:t>
-      </w:r>
-      <w:r>
-        <w:fldChar w:fldCharType="begin"/>
-      </w:r>
-      <w:r>
-        <w:instrText xml:space="preserve"> REF _Ref227344473 \h </w:instrText>
-      </w:r>
-      <w:r>
-        <w:fldChar w:fldCharType="separate"/>
-      </w:r>
-      <w:r>
-        <w:t xml:space="preserve">Table </w:t>
-      </w:r>
-      <w:r>
-        <w:rPr>
-          <w:noProof/>
-        </w:rPr>
-        <w:t>2</w:t>
-      </w:r>
-      <w:r>
-        <w:fldChar w:fldCharType="end"/>
-      </w:r>
-      <w:r>
-        <w:t>)</w:t>
-      </w:r>
-      <w:r>
-        <w:t>.</w:t>
+        <w:t>Two-dimensional UMAP projection of 810,517 papers coloured by scoring tier: core (red, 12 clusters by pipeline scoring, 323,551 papers, &gt;50% score 4–5), adjacent (orange, 11</w:t>
       </w:r>
     </w:p>
-    <w:p>
-      <w:pPr>
-        <w:pStyle w:val="Heading1"/>
-      </w:pPr>
-      <w:bookmarkStart w:id="13" w:name="_Toc231989214"/>
-      <w:r>
-        <w:t>References</w:t>
-      </w:r>
-      <w:bookmarkEnd w:id="13"/>
-    </w:p>
-    <w:p>
-      <w:pPr>
-        <w:pStyle w:val="Bibliography"/>
-      </w:pPr>
-      <w:r>
-        <w:t xml:space="preserve">Aasfar, A., </w:t>
-      </w:r>
-      <w:proofErr w:type="spellStart"/>
-      <w:r>
-        <w:t>Bargaz</w:t>
-      </w:r>
-      <w:proofErr w:type="spellEnd"/>
-      <w:r>
-        <w:t xml:space="preserve">, A., </w:t>
-      </w:r>
-      <w:proofErr w:type="spellStart"/>
-      <w:r>
-        <w:t>Yaakoubi</w:t>
-      </w:r>
-      <w:proofErr w:type="spellEnd"/>
-      <w:r>
-        <w:t xml:space="preserve">, K., Hilali, A., Bennis, I., Zeroual, Y., &amp; </w:t>
-      </w:r>
-      <w:proofErr w:type="spellStart"/>
-      <w:r>
-        <w:t>Kadmiri</w:t>
-      </w:r>
-      <w:proofErr w:type="spellEnd"/>
-      <w:r>
-        <w:t xml:space="preserve">, I. M. (2021). </w:t>
-      </w:r>
-      <w:r>
-        <w:t>Nitrogen-fixing</w:t>
-      </w:r>
-      <w:r>
-        <w:t xml:space="preserve"> Azotobacter species as potential soil biological enhancers for crop </w:t>
-      </w:r>
-      <w:r>
-        <w:lastRenderedPageBreak/>
-        <w:t xml:space="preserve">nutrition and yield stability. Frontiers in Microbiology, 12, 628379. </w:t>
-      </w:r>
-      <w:hyperlink r:id="rId11" w:tgtFrame="_blank" w:history="1">
-        <w:r>
-          <w:rPr>
-            <w:rStyle w:val="Hyperlink"/>
-          </w:rPr>
-          <w:t>https://doi.org/10.3389/fmicb.2021.628379</w:t>
-        </w:r>
-      </w:hyperlink>
-    </w:p>
-    <w:p>
-      <w:pPr>
-        <w:pStyle w:val="Bibliography"/>
-        <w:sectPr>
-          <w:footerReference w:type="default" r:id="rId12"/>
-          <w:pgSz w:w="12240" w:h="15840"/>
-          <w:pgMar w:top="1440" w:right="1440" w:bottom="1440" w:left="1440" w:header="567" w:footer="567" w:gutter="0"/>
-          <w:pgNumType w:fmt="lowerRoman" w:start="1" w:chapSep="colon"/>
-          <w:cols w:space="720"/>
-          <w:docGrid w:linePitch="326"/>
-        </w:sectPr>
-      </w:pPr>
-    </w:p>
-    <w:p>
-      <w:pPr>
-        <w:pStyle w:val="Title"/>
-      </w:pPr>
-      <w:r>
-        <w:lastRenderedPageBreak/>
-        <w:t>Supplementary Information</w:t>
-      </w:r>
-    </w:p>
-    <w:p>
-      <w:pPr>
-        <w:pStyle w:val="BodyText"/>
-      </w:pPr>
-      <w:bookmarkStart w:id="14" w:name="SI_S1"/>
-      <w:r>
-        <w:t>body text.</w:t>
-      </w:r>
-    </w:p>
-    <w:p>
-      <w:pPr>
-        <w:pStyle w:val="Heading1SI"/>
-        <w:rPr>
-          <w:bCs/>
-        </w:rPr>
-      </w:pPr>
-      <w:r>
-        <w:t>Within-Cluster Spatial Structure: Worked Examples</w:t>
-      </w:r>
-    </w:p>
-    <w:p>
-      <w:pPr>
-        <w:pStyle w:val="Heading1SI"/>
-      </w:pPr>
-      <w:bookmarkStart w:id="15" w:name="_Ref_figS1"/>
-      <w:bookmarkEnd w:id="14"/>
-      <w:r>
-        <w:t>body text.</w:t>
-      </w:r>
-    </w:p>
-    <w:p>
-      <w:pPr>
-        <w:pStyle w:val="BlockText"/>
-      </w:pPr>
-      <w:r>
-        <w:rPr>
-          <w:b/>
-          <w:bCs/>
-        </w:rPr>
-        <w:t>Supplementary Figure S1</w:t>
-      </w:r>
-      <w:bookmarkEnd w:id="15"/>
-      <w:r>
-        <w:rPr>
-          <w:b/>
-          <w:bCs/>
-        </w:rPr>
-        <w:t>. Within-cluster spatial modes in three multi-modal L1 clusters.</w:t>
-      </w:r>
-      <w:r>
-        <w:t xml:space="preserve"> Left column: full corpus UMAP (grey) with target L1 cluster highlighted. Right column: same view with papers coloured by spatial mode (histogram-based density peak detection, 100×100 grid, σ=2.0). (A–B) Environmental Biogeochemistry (L1=4, 54,445 papers): four modes separating the ecological core (34,621 papers), eDNA methodology (10,926), infrastructure hubs (6,122), and applied water ecology (2,472). The infrastructure mode sits 6.51 UMAP units from the ecological core. (C–D) Microbial Genomics (L1=5, 51,414 papers): two modes of near-equal size separating computational/analytical methods (25,843) from organismal/biological genomics (24,937), separated by 4.62 UMAP units. (E–F) Pollinator Biology (L1=18, 13,045 papers): three modes separating field ecology (7,342), pollinator gut microbiome research (3,072), and an intermediate interface community (2,597). The ecology–microbiome separation (8.40 UMAP units) is the largest intra-cluster distance in the corpus.</w:t>
-      </w:r>
-    </w:p>
-    <w:p>
-      <w:pPr>
-        <w:pStyle w:val="Heading1SI"/>
-      </w:pPr>
-      <w:bookmarkStart w:id="16" w:name="SI_S2"/>
-      <w:r>
-        <w:t>Scoring Validation</w:t>
-      </w:r>
-    </w:p>
-    <w:p>
-      <w:pPr>
-        <w:pStyle w:val="Heading2SI"/>
-      </w:pPr>
-      <w:bookmarkStart w:id="17" w:name="SI_S2_1"/>
-      <w:bookmarkEnd w:id="16"/>
-      <w:r>
-        <w:t>Relevance Scoring Rubric</w:t>
-      </w:r>
-    </w:p>
-    <w:bookmarkEnd w:id="17"/>
-    <w:p>
-      <w:pPr>
-        <w:pStyle w:val="Heading1SI"/>
-      </w:pPr>
-      <w:r>
-        <w:t>body text.</w:t>
-      </w:r>
-    </w:p>
-    <w:p>
-      <w:pPr>
-        <w:pStyle w:val="BodyText"/>
-        <w:rPr>
-          <w:b/>
-          <w:bCs/>
-        </w:rPr>
-      </w:pPr>
-      <w:r>
-        <w:rPr>
-          <w:b/>
-          <w:bCs/>
-        </w:rPr>
-        <w:t>Score 5</w:t>
-      </w:r>
-    </w:p>
-    <w:p>
-      <w:pPr>
-        <w:pStyle w:val="BodyText"/>
-      </w:pPr>
-      <w:r>
-        <w:t>body text.</w:t>
-      </w:r>
-    </w:p>
-    <w:p>
-      <w:pPr>
-        <w:pStyle w:val="BodyText"/>
-      </w:pPr>
-    </w:p>
     <w:sectPr>
+      <w:footerReference w:type="default" r:id="rId9"/>
       <w:pgSz w:w="12240" w:h="15840"/>
-      <w:pgMar w:top="1440" w:right="1440" w:bottom="1440" w:left="1440" w:header="567" w:footer="567" w:gutter="0"/>
+      <w:pgMar w:top="851" w:right="1134" w:bottom="851" w:left="1134" w:header="567" w:footer="567" w:gutter="0"/>
       <w:pgNumType w:start="1" w:chapSep="colon"/>
       <w:cols w:space="720"/>
       <w:docGrid w:linePitch="326"/>
@@ -1847,7 +1200,7 @@
 <w:ftr xmlns:wpc="http://schemas.microsoft.com/office/word/2010/wordprocessingCanvas" xmlns:cx="http://schemas.microsoft.com/office/drawing/2014/chartex" xmlns:cx1="http://schemas.microsoft.com/office/drawing/2015/9/8/chartex" xmlns:cx2="http://schemas.microsoft.com/office/drawing/2015/10/21/chartex" xmlns:cx3="http://schemas.microsoft.com/office/drawing/2016/5/9/chartex" xmlns:cx4="http://schemas.microsoft.com/office/drawing/2016/5/10/chartex" xmlns:cx5="http://schemas.microsoft.com/office/drawing/2016/5/11/chartex" xmlns:cx6="http://schemas.microsoft.com/office/drawing/2016/5/12/chartex" xmlns:cx7="http://schemas.microsoft.com/office/drawing/2016/5/13/chartex" xmlns:cx8="http://schemas.microsoft.com/office/drawing/2016/5/14/chartex" xmlns:mc="http://schemas.openxmlformats.org/markup-compatibility/2006" xmlns:aink="http://schemas.microsoft.com/office/drawing/2016/ink" xmlns:am3d="http://schemas.microsoft.com/office/drawing/2017/model3d" xmlns:o="urn:schemas-microsoft-com:office:office" xmlns:oel="http://schemas.microsoft.com/office/2019/extlst" xmlns:r="http://schemas.openxmlformats.org/officeDocument/2006/relationships" xmlns:m="http://schemas.openxmlformats.org/officeDocument/2006/math" xmlns:v="urn:schemas-microsoft-com:vml" xmlns:wp14="http://schemas.microsoft.com/office/word/2010/wordprocessingDrawing" xmlns:wp="http://schemas.openxmlformats.org/drawingml/2006/wordprocessingDrawing" xmlns:w10="urn:schemas-microsoft-com:office:word" xmlns:w="http://schemas.openxmlformats.org/wordprocessingml/2006/main" xmlns:w14="http://schemas.microsoft.com/office/word/2010/wordml" xmlns:w15="http://schemas.microsoft.com/office/word/2012/wordml" xmlns:w16cex="http://schemas.microsoft.com/office/word/2018/wordml/cex" xmlns:w16cid="http://schemas.microsoft.com/office/word/2016/wordml/cid" xmlns:w16="http://schemas.microsoft.com/office/word/2018/wordml" xmlns:w16du="http://schemas.microsoft.com/office/word/2023/wordml/word16du" xmlns:w16sdtdh="http://schemas.microsoft.com/office/word/2020/wordml/sdtdatahash" xmlns:w16sdtfl="http://schemas.microsoft.com/office/word/2024/wordml/sdtformatlock" xmlns:w16se="http://schemas.microsoft.com/office/word/2015/wordml/symex" xmlns:wpg="http://schemas.microsoft.com/office/word/2010/wordprocessingGroup" xmlns:wpi="http://schemas.microsoft.com/office/word/2010/wordprocessingInk" xmlns:wne="http://schemas.microsoft.com/office/word/2006/wordml" xmlns:wps="http://schemas.microsoft.com/office/word/2010/wordprocessingShape" mc:Ignorable="w14 w15 w16se w16cid w16 w16cex w16sdtdh w16sdtfl w16du wp14">
   <w:sdt>
     <w:sdtPr>
-      <w:id w:val="-2122984952"/>
+      <w:id w:val="1883356781"/>
       <w:docPartObj>
         <w:docPartGallery w:val="Page Numbers (Bottom of Page)"/>
         <w:docPartUnique/>
@@ -1888,64 +1241,6 @@
       </w:p>
     </w:sdtContent>
   </w:sdt>
-  <w:p>
-    <w:pPr>
-      <w:pStyle w:val="Footer"/>
-    </w:pPr>
-  </w:p>
-</w:ftr>
-</file>
-
-<file path=word/footer2.xml><?xml version="1.0" encoding="utf-8"?>
-<w:ftr xmlns:wpc="http://schemas.microsoft.com/office/word/2010/wordprocessingCanvas" xmlns:cx="http://schemas.microsoft.com/office/drawing/2014/chartex" xmlns:cx1="http://schemas.microsoft.com/office/drawing/2015/9/8/chartex" xmlns:cx2="http://schemas.microsoft.com/office/drawing/2015/10/21/chartex" xmlns:cx3="http://schemas.microsoft.com/office/drawing/2016/5/9/chartex" xmlns:cx4="http://schemas.microsoft.com/office/drawing/2016/5/10/chartex" xmlns:cx5="http://schemas.microsoft.com/office/drawing/2016/5/11/chartex" xmlns:cx6="http://schemas.microsoft.com/office/drawing/2016/5/12/chartex" xmlns:cx7="http://schemas.microsoft.com/office/drawing/2016/5/13/chartex" xmlns:cx8="http://schemas.microsoft.com/office/drawing/2016/5/14/chartex" xmlns:mc="http://schemas.openxmlformats.org/markup-compatibility/2006" xmlns:aink="http://schemas.microsoft.com/office/drawing/2016/ink" xmlns:am3d="http://schemas.microsoft.com/office/drawing/2017/model3d" xmlns:o="urn:schemas-microsoft-com:office:office" xmlns:oel="http://schemas.microsoft.com/office/2019/extlst" xmlns:r="http://schemas.openxmlformats.org/officeDocument/2006/relationships" xmlns:m="http://schemas.openxmlformats.org/officeDocument/2006/math" xmlns:v="urn:schemas-microsoft-com:vml" xmlns:wp14="http://schemas.microsoft.com/office/word/2010/wordprocessingDrawing" xmlns:wp="http://schemas.openxmlformats.org/drawingml/2006/wordprocessingDrawing" xmlns:w10="urn:schemas-microsoft-com:office:word" xmlns:w="http://schemas.openxmlformats.org/wordprocessingml/2006/main" xmlns:w14="http://schemas.microsoft.com/office/word/2010/wordml" xmlns:w15="http://schemas.microsoft.com/office/word/2012/wordml" xmlns:w16cex="http://schemas.microsoft.com/office/word/2018/wordml/cex" xmlns:w16cid="http://schemas.microsoft.com/office/word/2016/wordml/cid" xmlns:w16="http://schemas.microsoft.com/office/word/2018/wordml" xmlns:w16du="http://schemas.microsoft.com/office/word/2023/wordml/word16du" xmlns:w16sdtdh="http://schemas.microsoft.com/office/word/2020/wordml/sdtdatahash" xmlns:w16sdtfl="http://schemas.microsoft.com/office/word/2024/wordml/sdtformatlock" xmlns:w16se="http://schemas.microsoft.com/office/word/2015/wordml/symex" xmlns:wpg="http://schemas.microsoft.com/office/word/2010/wordprocessingGroup" xmlns:wpi="http://schemas.microsoft.com/office/word/2010/wordprocessingInk" xmlns:wne="http://schemas.microsoft.com/office/word/2006/wordml" xmlns:wps="http://schemas.microsoft.com/office/word/2010/wordprocessingShape" mc:Ignorable="w14 w15 w16se w16cid w16 w16cex w16sdtdh w16sdtfl w16du wp14">
-  <w:sdt>
-    <w:sdtPr>
-      <w:id w:val="1883356781"/>
-      <w:docPartObj>
-        <w:docPartGallery w:val="Page Numbers (Bottom of Page)"/>
-        <w:docPartUnique/>
-      </w:docPartObj>
-    </w:sdtPr>
-    <w:sdtEndPr>
-      <w:rPr>
-        <w:noProof/>
-      </w:rPr>
-    </w:sdtEndPr>
-    <w:sdtContent>
-      <w:p>
-        <w:pPr>
-          <w:pStyle w:val="Footer"/>
-          <w:jc w:val="right"/>
-        </w:pPr>
-        <w:r>
-          <w:fldChar w:fldCharType="begin"/>
-        </w:r>
-        <w:r>
-          <w:instrText xml:space="preserve"> PAGE   \* MERGEFORMAT </w:instrText>
-        </w:r>
-        <w:r>
-          <w:fldChar w:fldCharType="separate"/>
-        </w:r>
-        <w:r>
-          <w:rPr>
-            <w:noProof/>
-          </w:rPr>
-          <w:t>2</w:t>
-        </w:r>
-        <w:r>
-          <w:rPr>
-            <w:noProof/>
-          </w:rPr>
-          <w:fldChar w:fldCharType="end"/>
-        </w:r>
-      </w:p>
-    </w:sdtContent>
-  </w:sdt>
-  <w:p>
-    <w:pPr>
-      <w:pStyle w:val="Footer"/>
-    </w:pPr>
-  </w:p>
 </w:ftr>
 </file>
 
@@ -1966,33 +1261,6 @@
     </w:p>
   </w:footnote>
 </w:footnotes>
-</file>
-
-<file path=word/header1.xml><?xml version="1.0" encoding="utf-8"?>
-<w:hdr xmlns:wpc="http://schemas.microsoft.com/office/word/2010/wordprocessingCanvas" xmlns:cx="http://schemas.microsoft.com/office/drawing/2014/chartex" xmlns:cx1="http://schemas.microsoft.com/office/drawing/2015/9/8/chartex" xmlns:cx2="http://schemas.microsoft.com/office/drawing/2015/10/21/chartex" xmlns:cx3="http://schemas.microsoft.com/office/drawing/2016/5/9/chartex" xmlns:cx4="http://schemas.microsoft.com/office/drawing/2016/5/10/chartex" xmlns:cx5="http://schemas.microsoft.com/office/drawing/2016/5/11/chartex" xmlns:cx6="http://schemas.microsoft.com/office/drawing/2016/5/12/chartex" xmlns:cx7="http://schemas.microsoft.com/office/drawing/2016/5/13/chartex" xmlns:cx8="http://schemas.microsoft.com/office/drawing/2016/5/14/chartex" xmlns:mc="http://schemas.openxmlformats.org/markup-compatibility/2006" xmlns:aink="http://schemas.microsoft.com/office/drawing/2016/ink" xmlns:am3d="http://schemas.microsoft.com/office/drawing/2017/model3d" xmlns:o="urn:schemas-microsoft-com:office:office" xmlns:oel="http://schemas.microsoft.com/office/2019/extlst" xmlns:r="http://schemas.openxmlformats.org/officeDocument/2006/relationships" xmlns:m="http://schemas.openxmlformats.org/officeDocument/2006/math" xmlns:v="urn:schemas-microsoft-com:vml" xmlns:wp14="http://schemas.microsoft.com/office/word/2010/wordprocessingDrawing" xmlns:wp="http://schemas.openxmlformats.org/drawingml/2006/wordprocessingDrawing" xmlns:w10="urn:schemas-microsoft-com:office:word" xmlns:w="http://schemas.openxmlformats.org/wordprocessingml/2006/main" xmlns:w14="http://schemas.microsoft.com/office/word/2010/wordml" xmlns:w15="http://schemas.microsoft.com/office/word/2012/wordml" xmlns:w16cex="http://schemas.microsoft.com/office/word/2018/wordml/cex" xmlns:w16cid="http://schemas.microsoft.com/office/word/2016/wordml/cid" xmlns:w16="http://schemas.microsoft.com/office/word/2018/wordml" xmlns:w16du="http://schemas.microsoft.com/office/word/2023/wordml/word16du" xmlns:w16sdtdh="http://schemas.microsoft.com/office/word/2020/wordml/sdtdatahash" xmlns:w16sdtfl="http://schemas.microsoft.com/office/word/2024/wordml/sdtformatlock" xmlns:w16se="http://schemas.microsoft.com/office/word/2015/wordml/symex" xmlns:wpg="http://schemas.microsoft.com/office/word/2010/wordprocessingGroup" xmlns:wpi="http://schemas.microsoft.com/office/word/2010/wordprocessingInk" xmlns:wne="http://schemas.microsoft.com/office/word/2006/wordml" xmlns:wps="http://schemas.microsoft.com/office/word/2010/wordprocessingShape" mc:Ignorable="w14 w15 w16se w16cid w16 w16cex w16sdtdh w16sdtfl w16du wp14">
-  <w:p>
-    <w:pPr>
-      <w:pStyle w:val="Header"/>
-    </w:pPr>
-    <w:r>
-      <w:t>Document</w:t>
-    </w:r>
-    <w:r>
-      <w:tab/>
-      <w:t>DRAF</w:t>
-    </w:r>
-    <w:r>
-      <w:t>T</w:t>
-    </w:r>
-    <w:r>
-      <w:tab/>
-      <w:t xml:space="preserve"> </w:t>
-    </w:r>
-    <w:r>
-      <w:t>Name</w:t>
-    </w:r>
-  </w:p>
-</w:hdr>
 </file>
 
 <file path=word/numbering.xml><?xml version="1.0" encoding="utf-8"?>
@@ -3077,7 +2345,7 @@
   <w:abstractNum w:abstractNumId="19" w15:restartNumberingAfterBreak="0">
     <w:nsid w:val="664367C4"/>
     <w:multiLevelType w:val="multilevel"/>
-    <w:tmpl w:val="5D4C9C58"/>
+    <w:tmpl w:val="109697D4"/>
     <w:lvl w:ilvl="0">
       <w:start w:val="1"/>
       <w:numFmt w:val="decimal"/>
@@ -3866,14 +3134,14 @@
     <w:autoRedefine/>
     <w:uiPriority w:val="9"/>
     <w:qFormat/>
-    <w:rsid w:val="00437412"/>
+    <w:rsid w:val="006217A1"/>
     <w:pPr>
       <w:keepNext/>
       <w:keepLines/>
       <w:numPr>
         <w:numId w:val="18"/>
       </w:numPr>
-      <w:spacing w:before="480" w:after="240"/>
+      <w:spacing w:before="240" w:after="0"/>
       <w:outlineLvl w:val="0"/>
     </w:pPr>
     <w:rPr>
@@ -3892,7 +3160,7 @@
     <w:uiPriority w:val="9"/>
     <w:unhideWhenUsed/>
     <w:qFormat/>
-    <w:rsid w:val="00437412"/>
+    <w:rsid w:val="006217A1"/>
     <w:pPr>
       <w:keepNext/>
       <w:keepLines/>
@@ -3900,7 +3168,7 @@
         <w:ilvl w:val="1"/>
         <w:numId w:val="18"/>
       </w:numPr>
-      <w:spacing w:before="200" w:after="240"/>
+      <w:spacing w:after="0"/>
       <w:outlineLvl w:val="1"/>
     </w:pPr>
     <w:rPr>
@@ -3919,7 +3187,7 @@
     <w:uiPriority w:val="9"/>
     <w:unhideWhenUsed/>
     <w:qFormat/>
-    <w:rsid w:val="00437412"/>
+    <w:rsid w:val="006217A1"/>
     <w:pPr>
       <w:keepNext/>
       <w:keepLines/>
@@ -3927,7 +3195,7 @@
         <w:ilvl w:val="2"/>
         <w:numId w:val="18"/>
       </w:numPr>
-      <w:spacing w:before="200" w:after="240"/>
+      <w:spacing w:after="0"/>
       <w:outlineLvl w:val="2"/>
     </w:pPr>
     <w:rPr>
@@ -3944,7 +3212,7 @@
     <w:uiPriority w:val="9"/>
     <w:unhideWhenUsed/>
     <w:qFormat/>
-    <w:rsid w:val="00437412"/>
+    <w:rsid w:val="009078D3"/>
     <w:pPr>
       <w:keepNext/>
       <w:keepLines/>
@@ -3952,12 +3220,12 @@
         <w:ilvl w:val="3"/>
         <w:numId w:val="18"/>
       </w:numPr>
-      <w:spacing w:before="200" w:after="0"/>
+      <w:spacing w:after="0"/>
       <w:outlineLvl w:val="3"/>
     </w:pPr>
     <w:rPr>
       <w:rFonts w:eastAsiaTheme="majorEastAsia" w:cstheme="majorBidi"/>
-      <w:bCs/>
+      <w:b/>
       <w:i/>
     </w:rPr>
   </w:style>
@@ -4076,7 +3344,6 @@
   <w:style w:type="character" w:default="1" w:styleId="DefaultParagraphFont">
     <w:name w:val="Default Paragraph Font"/>
     <w:uiPriority w:val="1"/>
-    <w:semiHidden/>
     <w:unhideWhenUsed/>
   </w:style>
   <w:style w:type="table" w:default="1" w:styleId="TableNormal">
@@ -4105,9 +3372,10 @@
     <w:basedOn w:val="Normal"/>
     <w:link w:val="BodyTextChar"/>
     <w:qFormat/>
-    <w:rsid w:val="00324057"/>
-    <w:pPr>
-      <w:spacing w:before="180" w:after="180"/>
+    <w:rsid w:val="006217A1"/>
+    <w:pPr>
+      <w:spacing w:after="0" w:line="480" w:lineRule="auto"/>
+      <w:ind w:firstLine="720"/>
       <w:jc w:val="both"/>
     </w:pPr>
     <w:rPr>
@@ -4132,11 +3400,11 @@
     <w:next w:val="BodyText"/>
     <w:link w:val="TitleChar"/>
     <w:qFormat/>
-    <w:rsid w:val="00E871FE"/>
+    <w:rsid w:val="00EC0B91"/>
     <w:pPr>
       <w:keepNext/>
       <w:keepLines/>
-      <w:spacing w:before="480" w:after="240"/>
+      <w:spacing w:after="0"/>
     </w:pPr>
     <w:rPr>
       <w:rFonts w:eastAsiaTheme="majorEastAsia" w:cstheme="majorBidi"/>
@@ -4184,11 +3452,11 @@
     <w:basedOn w:val="Normal"/>
     <w:next w:val="Abstract"/>
     <w:qFormat/>
-    <w:rsid w:val="008E0036"/>
+    <w:rsid w:val="00EC0B91"/>
     <w:pPr>
       <w:keepNext/>
       <w:keepLines/>
-      <w:spacing w:before="300" w:after="0"/>
+      <w:spacing w:after="0"/>
     </w:pPr>
     <w:rPr>
       <w:b/>
@@ -4201,11 +3469,11 @@
     <w:basedOn w:val="Normal"/>
     <w:next w:val="BodyText"/>
     <w:qFormat/>
-    <w:rsid w:val="00AB2B56"/>
+    <w:rsid w:val="00EC0B91"/>
     <w:pPr>
       <w:keepNext/>
       <w:keepLines/>
-      <w:spacing w:before="100" w:after="300"/>
+      <w:spacing w:after="0"/>
     </w:pPr>
     <w:rPr>
       <w:szCs w:val="20"/>
@@ -4408,7 +3676,7 @@
     <w:qFormat/>
     <w:rsid w:val="00437412"/>
     <w:pPr>
-      <w:spacing w:before="240" w:line="259" w:lineRule="auto"/>
+      <w:spacing w:line="259" w:lineRule="auto"/>
       <w:outlineLvl w:val="9"/>
     </w:pPr>
     <w:rPr>
@@ -4798,7 +4066,7 @@
     <w:basedOn w:val="DefaultParagraphFont"/>
     <w:link w:val="Heading1"/>
     <w:uiPriority w:val="9"/>
-    <w:rsid w:val="00437412"/>
+    <w:rsid w:val="006217A1"/>
     <w:rPr>
       <w:rFonts w:eastAsiaTheme="majorEastAsia" w:cstheme="majorBidi"/>
       <w:b/>
@@ -4813,7 +4081,7 @@
     <w:basedOn w:val="DefaultParagraphFont"/>
     <w:link w:val="Heading2"/>
     <w:uiPriority w:val="9"/>
-    <w:rsid w:val="00437412"/>
+    <w:rsid w:val="006217A1"/>
     <w:rPr>
       <w:rFonts w:eastAsiaTheme="majorEastAsia" w:cstheme="majorBidi"/>
       <w:b/>
@@ -4827,7 +4095,7 @@
     <w:name w:val="Body Text Char"/>
     <w:basedOn w:val="DefaultParagraphFont"/>
     <w:link w:val="BodyText"/>
-    <w:rsid w:val="00324057"/>
+    <w:rsid w:val="006217A1"/>
     <w:rPr>
       <w:szCs w:val="20"/>
       <w:lang w:val="en-NZ"/>
@@ -4901,7 +4169,7 @@
     <w:basedOn w:val="DefaultParagraphFont"/>
     <w:link w:val="Heading3"/>
     <w:uiPriority w:val="9"/>
-    <w:rsid w:val="00437412"/>
+    <w:rsid w:val="006217A1"/>
     <w:rPr>
       <w:rFonts w:eastAsiaTheme="majorEastAsia" w:cstheme="majorBidi"/>
       <w:b/>
@@ -4914,10 +4182,10 @@
     <w:basedOn w:val="DefaultParagraphFont"/>
     <w:link w:val="Heading4"/>
     <w:uiPriority w:val="9"/>
-    <w:rsid w:val="00437412"/>
+    <w:rsid w:val="009078D3"/>
     <w:rPr>
       <w:rFonts w:eastAsiaTheme="majorEastAsia" w:cstheme="majorBidi"/>
-      <w:bCs/>
+      <w:b/>
       <w:i/>
       <w:lang w:val="en-NZ"/>
     </w:rPr>
@@ -4926,7 +4194,7 @@
     <w:name w:val="Title Char"/>
     <w:basedOn w:val="DefaultParagraphFont"/>
     <w:link w:val="Title"/>
-    <w:rsid w:val="00E871FE"/>
+    <w:rsid w:val="00EC0B91"/>
     <w:rPr>
       <w:rFonts w:eastAsiaTheme="majorEastAsia" w:cstheme="majorBidi"/>
       <w:b/>
@@ -5748,7 +5016,7 @@
     <w:link w:val="BodyTextFirstIndentChar"/>
     <w:rsid w:val="00A42B35"/>
     <w:pPr>
-      <w:spacing w:before="0" w:after="200"/>
+      <w:spacing w:after="200"/>
       <w:ind w:firstLine="360"/>
     </w:pPr>
     <w:rPr>

</xml_diff>